<commit_message>
Improved Device Summary: hardcoded metrics iteration to avoid .Keys property access, suppressed COM interop warnings
</commit_message>
<xml_diff>
--- a/output.docx
+++ b/output.docx
@@ -8155,7 +8155,6 @@
                 <w:color w:val="FFFFFF"/>
                 <w:lang w:val="en-US"/>
               </w:rPr>
-              <w:lastRenderedPageBreak/>
               <w:t>Domain Name</w:t>
             </w:r>
           </w:p>
@@ -8842,6 +8841,7 @@
               <w:rPr>
                 <w:lang w:val="en-US"/>
               </w:rPr>
+              <w:lastRenderedPageBreak/>
               <w:t>10.1.1.0/24</w:t>
             </w:r>
           </w:p>
@@ -9112,51 +9112,37 @@
               <w:rPr>
                 <w:lang w:val="en-US"/>
               </w:rPr>
-              <w:t>CN=London970CoLo,CN=Sites,CN=Configuration,DC=corp,DC=voyage</w:t>
-            </w:r>
-            <w:r>
-              <w:rPr>
-                <w:lang w:val="en-US"/>
-              </w:rPr>
-              <w:lastRenderedPageBreak/>
-              <w:t>urtransportation,DC=ca</w:t>
-            </w:r>
-          </w:p>
-        </w:tc>
-        <w:tc>
-          <w:tcPr>
-            <w:tcW w:w="1872" w:type="dxa"/>
-          </w:tcPr>
-          <w:p>
-            <w:pPr>
-              <w:rPr>
-                <w:lang w:val="en-US"/>
-              </w:rPr>
-            </w:pPr>
-          </w:p>
-        </w:tc>
-        <w:tc>
-          <w:tcPr>
-            <w:tcW w:w="1872" w:type="dxa"/>
-          </w:tcPr>
-          <w:p>
-            <w:pPr>
-              <w:rPr>
-                <w:lang w:val="en-US"/>
-              </w:rPr>
-            </w:pPr>
-            <w:r>
-              <w:rPr>
-                <w:lang w:val="en-US"/>
-              </w:rPr>
-              <w:t>CN=10.4.0.0/16,CN=Subnets,CN=Sites,CN=Configuration,DC=corp,DC=</w:t>
-            </w:r>
-            <w:r>
-              <w:rPr>
-                <w:lang w:val="en-US"/>
-              </w:rPr>
-              <w:lastRenderedPageBreak/>
-              <w:t>voyageurtransportation,DC=ca</w:t>
+              <w:t>CN=London970CoLo,CN=Sites,CN=Configuration,DC=corp,DC=voyageurtransportation,DC=ca</w:t>
+            </w:r>
+          </w:p>
+        </w:tc>
+        <w:tc>
+          <w:tcPr>
+            <w:tcW w:w="1872" w:type="dxa"/>
+          </w:tcPr>
+          <w:p>
+            <w:pPr>
+              <w:rPr>
+                <w:lang w:val="en-US"/>
+              </w:rPr>
+            </w:pPr>
+          </w:p>
+        </w:tc>
+        <w:tc>
+          <w:tcPr>
+            <w:tcW w:w="1872" w:type="dxa"/>
+          </w:tcPr>
+          <w:p>
+            <w:pPr>
+              <w:rPr>
+                <w:lang w:val="en-US"/>
+              </w:rPr>
+            </w:pPr>
+            <w:r>
+              <w:rPr>
+                <w:lang w:val="en-US"/>
+              </w:rPr>
+              <w:t>CN=10.4.0.0/16,CN=Subnets,CN=Sites,CN=Configuration,DC=corp,DC=voyageurtransportation,DC=ca</w:t>
             </w:r>
           </w:p>
         </w:tc>
@@ -9888,51 +9874,37 @@
               <w:rPr>
                 <w:lang w:val="en-US"/>
               </w:rPr>
-              <w:t>CN=London970CoLo,CN=Sites,CN=Configuration,DC=corp,DC=voyage</w:t>
-            </w:r>
-            <w:r>
-              <w:rPr>
-                <w:lang w:val="en-US"/>
-              </w:rPr>
-              <w:lastRenderedPageBreak/>
-              <w:t>urtransportation,DC=ca</w:t>
-            </w:r>
-          </w:p>
-        </w:tc>
-        <w:tc>
-          <w:tcPr>
-            <w:tcW w:w="1872" w:type="dxa"/>
-          </w:tcPr>
-          <w:p>
-            <w:pPr>
-              <w:rPr>
-                <w:lang w:val="en-US"/>
-              </w:rPr>
-            </w:pPr>
-          </w:p>
-        </w:tc>
-        <w:tc>
-          <w:tcPr>
-            <w:tcW w:w="1872" w:type="dxa"/>
-          </w:tcPr>
-          <w:p>
-            <w:pPr>
-              <w:rPr>
-                <w:lang w:val="en-US"/>
-              </w:rPr>
-            </w:pPr>
-            <w:r>
-              <w:rPr>
-                <w:lang w:val="en-US"/>
-              </w:rPr>
-              <w:t>CN=10.1.60.0/24,CN=Subnets,CN=Sites,CN=Configuration,DC=corp,D</w:t>
-            </w:r>
-            <w:r>
-              <w:rPr>
-                <w:lang w:val="en-US"/>
-              </w:rPr>
-              <w:lastRenderedPageBreak/>
-              <w:t>C=voyageurtransportation,DC=ca</w:t>
+              <w:t>CN=London970CoLo,CN=Sites,CN=Configuration,DC=corp,DC=voyageurtransportation,DC=ca</w:t>
+            </w:r>
+          </w:p>
+        </w:tc>
+        <w:tc>
+          <w:tcPr>
+            <w:tcW w:w="1872" w:type="dxa"/>
+          </w:tcPr>
+          <w:p>
+            <w:pPr>
+              <w:rPr>
+                <w:lang w:val="en-US"/>
+              </w:rPr>
+            </w:pPr>
+          </w:p>
+        </w:tc>
+        <w:tc>
+          <w:tcPr>
+            <w:tcW w:w="1872" w:type="dxa"/>
+          </w:tcPr>
+          <w:p>
+            <w:pPr>
+              <w:rPr>
+                <w:lang w:val="en-US"/>
+              </w:rPr>
+            </w:pPr>
+            <w:r>
+              <w:rPr>
+                <w:lang w:val="en-US"/>
+              </w:rPr>
+              <w:t>CN=10.1.60.0/24,CN=Subnets,CN=Sites,CN=Configuration,DC=corp,DC=voyageurtransportation,DC=ca</w:t>
             </w:r>
           </w:p>
         </w:tc>
@@ -10661,51 +10633,37 @@
               <w:rPr>
                 <w:lang w:val="en-US"/>
               </w:rPr>
-              <w:t>CN=London970CoLo,CN=Sites,CN=Configuration,DC=corp,DC=voyage</w:t>
-            </w:r>
-            <w:r>
-              <w:rPr>
-                <w:lang w:val="en-US"/>
-              </w:rPr>
-              <w:lastRenderedPageBreak/>
-              <w:t>urtransportation,DC=ca</w:t>
-            </w:r>
-          </w:p>
-        </w:tc>
-        <w:tc>
-          <w:tcPr>
-            <w:tcW w:w="1872" w:type="dxa"/>
-          </w:tcPr>
-          <w:p>
-            <w:pPr>
-              <w:rPr>
-                <w:lang w:val="en-US"/>
-              </w:rPr>
-            </w:pPr>
-          </w:p>
-        </w:tc>
-        <w:tc>
-          <w:tcPr>
-            <w:tcW w:w="1872" w:type="dxa"/>
-          </w:tcPr>
-          <w:p>
-            <w:pPr>
-              <w:rPr>
-                <w:lang w:val="en-US"/>
-              </w:rPr>
-            </w:pPr>
-            <w:r>
-              <w:rPr>
-                <w:lang w:val="en-US"/>
-              </w:rPr>
-              <w:t>CN=10.40.72.128/27,CN=Subnets,CN=Sites,CN=Configuration,DC=corp,</w:t>
-            </w:r>
-            <w:r>
-              <w:rPr>
-                <w:lang w:val="en-US"/>
-              </w:rPr>
-              <w:lastRenderedPageBreak/>
-              <w:t>DC=voyageurtransportation,DC=ca</w:t>
+              <w:t>CN=London970CoLo,CN=Sites,CN=Configuration,DC=corp,DC=voyageurtransportation,DC=ca</w:t>
+            </w:r>
+          </w:p>
+        </w:tc>
+        <w:tc>
+          <w:tcPr>
+            <w:tcW w:w="1872" w:type="dxa"/>
+          </w:tcPr>
+          <w:p>
+            <w:pPr>
+              <w:rPr>
+                <w:lang w:val="en-US"/>
+              </w:rPr>
+            </w:pPr>
+          </w:p>
+        </w:tc>
+        <w:tc>
+          <w:tcPr>
+            <w:tcW w:w="1872" w:type="dxa"/>
+          </w:tcPr>
+          <w:p>
+            <w:pPr>
+              <w:rPr>
+                <w:lang w:val="en-US"/>
+              </w:rPr>
+            </w:pPr>
+            <w:r>
+              <w:rPr>
+                <w:lang w:val="en-US"/>
+              </w:rPr>
+              <w:t>CN=10.40.72.128/27,CN=Subnets,CN=Sites,CN=Configuration,DC=corp,DC=voyageurtransportation,DC=ca</w:t>
             </w:r>
           </w:p>
         </w:tc>
@@ -11437,51 +11395,37 @@
               <w:rPr>
                 <w:lang w:val="en-US"/>
               </w:rPr>
-              <w:t>CN=London970CoLo,CN=Sites,CN=Configuration,DC=corp,DC=voyage</w:t>
-            </w:r>
-            <w:r>
-              <w:rPr>
-                <w:lang w:val="en-US"/>
-              </w:rPr>
-              <w:lastRenderedPageBreak/>
-              <w:t>urtransportation,DC=ca</w:t>
-            </w:r>
-          </w:p>
-        </w:tc>
-        <w:tc>
-          <w:tcPr>
-            <w:tcW w:w="1872" w:type="dxa"/>
-          </w:tcPr>
-          <w:p>
-            <w:pPr>
-              <w:rPr>
-                <w:lang w:val="en-US"/>
-              </w:rPr>
-            </w:pPr>
-          </w:p>
-        </w:tc>
-        <w:tc>
-          <w:tcPr>
-            <w:tcW w:w="1872" w:type="dxa"/>
-          </w:tcPr>
-          <w:p>
-            <w:pPr>
-              <w:rPr>
-                <w:lang w:val="en-US"/>
-              </w:rPr>
-            </w:pPr>
-            <w:r>
-              <w:rPr>
-                <w:lang w:val="en-US"/>
-              </w:rPr>
-              <w:t>CN=10.40.76.0/24,CN=Subnets,CN=Sites,CN=Configuration,DC=corp,</w:t>
-            </w:r>
-            <w:r>
-              <w:rPr>
-                <w:lang w:val="en-US"/>
-              </w:rPr>
-              <w:lastRenderedPageBreak/>
-              <w:t>DC=voyageurtransportation,DC=ca</w:t>
+              <w:t>CN=London970CoLo,CN=Sites,CN=Configuration,DC=corp,DC=voyageurtransportation,DC=ca</w:t>
+            </w:r>
+          </w:p>
+        </w:tc>
+        <w:tc>
+          <w:tcPr>
+            <w:tcW w:w="1872" w:type="dxa"/>
+          </w:tcPr>
+          <w:p>
+            <w:pPr>
+              <w:rPr>
+                <w:lang w:val="en-US"/>
+              </w:rPr>
+            </w:pPr>
+          </w:p>
+        </w:tc>
+        <w:tc>
+          <w:tcPr>
+            <w:tcW w:w="1872" w:type="dxa"/>
+          </w:tcPr>
+          <w:p>
+            <w:pPr>
+              <w:rPr>
+                <w:lang w:val="en-US"/>
+              </w:rPr>
+            </w:pPr>
+            <w:r>
+              <w:rPr>
+                <w:lang w:val="en-US"/>
+              </w:rPr>
+              <w:t>CN=10.40.76.0/24,CN=Subnets,CN=Sites,CN=Configuration,DC=corp,DC=voyageurtransportation,DC=ca</w:t>
             </w:r>
           </w:p>
         </w:tc>
@@ -12185,6 +12129,7 @@
         </w:rPr>
       </w:pPr>
       <w:r>
+        <w:lastRenderedPageBreak/>
         <w:t xml:space="preserve">The table below shows the </w:t>
       </w:r>
       <w:r>
@@ -12728,7 +12673,6 @@
         <w:rPr>
           <w:noProof/>
         </w:rPr>
-        <w:lastRenderedPageBreak/>
         <w:t>AD Recycle Bin</w:t>
       </w:r>
       <w:bookmarkEnd w:id="38"/>
@@ -30976,6 +30920,7 @@
           <w:noProof/>
           <w:lang w:val="en-US"/>
         </w:rPr>
+        <w:lastRenderedPageBreak/>
         <w:t>Entra</w:t>
       </w:r>
       <w:r>
@@ -31636,6 +31581,7 @@
         <w:rPr>
           <w:noProof/>
         </w:rPr>
+        <w:lastRenderedPageBreak/>
         <w:t xml:space="preserve">Mailboxes </w:t>
       </w:r>
       <w:r>
@@ -32138,6 +32084,7 @@
           <w:b/>
           <w:bCs/>
         </w:rPr>
+        <w:lastRenderedPageBreak/>
         <w:t xml:space="preserve">Findings: </w:t>
       </w:r>
       <w:r>
@@ -32813,7 +32760,14 @@
         <w:rPr>
           <w:rFonts w:cs="Arial"/>
         </w:rPr>
-        <w:t>Migration tool.  Note that if done in the migration tool there is no synchronization of membership removal over time.  If membership adds and removals are required, then there is a synchronization tool in the toolset for that purpose (part of the ODM AD tool set).</w:t>
+        <w:t xml:space="preserve">Migration tool.  Note that if done in the migration tool there is no </w:t>
+      </w:r>
+      <w:r>
+        <w:rPr>
+          <w:rFonts w:cs="Arial"/>
+        </w:rPr>
+        <w:lastRenderedPageBreak/>
+        <w:t>synchronization of membership removal over time.  If membership adds and removals are required, then there is a synchronization tool in the toolset for that purpose (part of the ODM AD tool set).</w:t>
       </w:r>
     </w:p>
     <w:p>
@@ -33390,6 +33344,7 @@
           <w:b/>
           <w:bCs/>
         </w:rPr>
+        <w:lastRenderedPageBreak/>
         <w:t>Findings</w:t>
       </w:r>
       <w:r>
@@ -33930,6 +33885,7 @@
           <w:noProof/>
           <w:lang w:val="fr-FR"/>
         </w:rPr>
+        <w:lastRenderedPageBreak/>
         <w:t>Virtual Desktop (VDI, Citrix, etc.)</w:t>
       </w:r>
       <w:bookmarkEnd w:id="113"/>
@@ -34037,6 +33993,7 @@
         <w:rPr>
           <w:noProof/>
         </w:rPr>
+        <w:lastRenderedPageBreak/>
         <w:t>Appendices</w:t>
       </w:r>
       <w:bookmarkEnd w:id="114"/>

</xml_diff>